<commit_message>
Capítulo 1: versión más oscura (desempleo, familia, traición de amigos y Nayeli)
Co-Authored-By: Claude Sonnet 5.5 <noreply@anthropic.com>
Claude-Session: https://claude.ai/code/session_01Ca8gTYErfYB39iNce8VLty
</commit_message>
<xml_diff>
--- a/diario-de-david/capitulo-01.docx
+++ b/diario-de-david/capitulo-01.docx
@@ -39,13 +39,13 @@
         <w:t xml:space="preserve">CAPÍTULO 1</w:t>
       </w:r>
     </w:p>
-    <w:bookmarkStart w:id="20" w:name="lo-que-queda-cuando-todos-se-van"/>
+    <w:bookmarkStart w:id="20" w:name="nadie-se-queda"/>
     <w:p>
       <w:pPr>
         <w:pStyle w:val="Heading3"/>
       </w:pPr>
       <w:r>
-        <w:t xml:space="preserve">Lo que queda cuando todos se van</w:t>
+        <w:t xml:space="preserve">Nadie se queda</w:t>
       </w:r>
     </w:p>
     <w:p>
@@ -80,23 +80,128 @@
         <w:pStyle w:val="BodyText"/>
       </w:pPr>
       <w:r>
-        <w:t xml:space="preserve">Llevo veinte minutos así. La pluma sobre el papel, el cuarto en silencio y una pregunta que no me deja en paz: ¿por qué escribir justo hoy, si hoy no pasó nada distinto a ayer? Y creo que esa es la respuesta. Hoy escribo porque ayer no pasó nada, y antes de ayer tampoco, y llevo tanto tiempo sin que pase nada que empiezo a sentir que yo mismo me estoy volviendo parte de los muebles.</w:t>
-      </w:r>
-    </w:p>
-    <w:p>
-      <w:pPr>
-        <w:pStyle w:val="BodyText"/>
-      </w:pPr>
-      <w:r>
-        <w:t xml:space="preserve">Me llamo David. Tengo dieciocho años. Los cumplí hace tres semanas y casi nadie se enteró. Mi mamá sí se acordó. Antes de irse a su turno me dejó en la cocina un pan de elote con una vela encima. Ni siquiera estaba prendida. La prendí yo, solo, con el encendedor de la estufa, y me quedé viendo la flama sin saber qué pedir. Después de un rato pedí que dejara de doler. No sé si las velas sin canción cuentan. Creo que no, porque sigue doliendo.</w:t>
-      </w:r>
-    </w:p>
-    <w:p>
-      <w:pPr>
-        <w:pStyle w:val="BodyText"/>
-      </w:pPr>
-      <w:r>
-        <w:t xml:space="preserve">Esta mañana encontré el cuaderno en el fondo de un cajón. Era de la prepa, tenía las primeras seis hojas usadas con apuntes de química y el resto en blanco. Arranqué las seis hojas, las tiré a la basura y me quedé con el resto. Es azul, de pasta blanda, con una esquina doblada porque se me cayó una vez en el camión. No es nada especial. Pero era lo que tenía a la mano, y a veces eso basta para empezar.</w:t>
+        <w:t xml:space="preserve">Llevo veinte minutos así. La pluma sobre el papel, la casa en silencio y una pregunta que no me suelta: ¿por qué escribir justo hoy, si hoy no pasó nada distinto a ayer? Y creo que esa es la respuesta. Escribo hoy porque ayer no pasó nada, y antes de ayer tampoco, y llevo tanto tiempo sin que pase nada que empiezo a sentir que me estoy volviendo parte de los muebles. Una silla más. Algo que está ahí, que ocupa lugar, pero que nadie voltea a ver.</w:t>
+      </w:r>
+    </w:p>
+    <w:p>
+      <w:pPr>
+        <w:pStyle w:val="BodyText"/>
+      </w:pPr>
+      <w:r>
+        <w:t xml:space="preserve">Me llamo David. Tengo dieciocho años. Los cumplí hace tres semanas.</w:t>
+      </w:r>
+    </w:p>
+    <w:p>
+      <w:pPr>
+        <w:pStyle w:val="BodyText"/>
+      </w:pPr>
+      <w:r>
+        <w:t xml:space="preserve">Voy a contar cómo fue mi cumpleaños, porque creo que es la mejor manera de explicar quién soy ahora.</w:t>
+      </w:r>
+    </w:p>
+    <w:p>
+      <w:pPr>
+        <w:pStyle w:val="BodyText"/>
+      </w:pPr>
+      <w:r>
+        <w:t xml:space="preserve">Nadie se acordó.</w:t>
+      </w:r>
+    </w:p>
+    <w:p>
+      <w:pPr>
+        <w:pStyle w:val="BodyText"/>
+      </w:pPr>
+      <w:r>
+        <w:t xml:space="preserve">Ni mi mamá, que llegó a las siete de la mañana de su turno con los ojos rojos y se fue directo a dormir. Ni mi hermano Iván, que vive en el cuarto de al lado y que en toda la mañana no salió de ahí más que para ir al baño. Ni mi papá, que no sé dónde vive. Ni mis tíos, ni mis primos, ni los compañeros del equipo, ni los de la prepa, ni Chuy, ni nadie. Ni un mensaje. Ni un</w:t>
+      </w:r>
+      <w:r>
+        <w:t xml:space="preserve"> </w:t>
+      </w:r>
+      <w:r>
+        <w:t xml:space="preserve">“</w:t>
+      </w:r>
+      <w:r>
+        <w:t xml:space="preserve">feliz cumpleaños</w:t>
+      </w:r>
+      <w:r>
+        <w:t xml:space="preserve">”</w:t>
+      </w:r>
+      <w:r>
+        <w:t xml:space="preserve"> </w:t>
+      </w:r>
+      <w:r>
+        <w:t xml:space="preserve">con tres emojis de pastel, de esos que la gente manda sin pensar solo porque Facebook se los recuerda. Ni siquiera Facebook se acordó.</w:t>
+      </w:r>
+    </w:p>
+    <w:p>
+      <w:pPr>
+        <w:pStyle w:val="BodyText"/>
+      </w:pPr>
+      <w:r>
+        <w:t xml:space="preserve">A las nueve de la noche bajé a la cocina. Abrí la alacena y encontré una concha de las que había comprado mi mamá para el desayuno. Era de vainilla, ya medio dura. Le clavé una velita de las que sobraron de un cumpleaños de hace años, la prendí con el encendedor de la estufa y me senté frente a ella, en la mesa, solo.</w:t>
+      </w:r>
+    </w:p>
+    <w:p>
+      <w:pPr>
+        <w:pStyle w:val="BodyText"/>
+      </w:pPr>
+      <w:r>
+        <w:t xml:space="preserve">Me quedé viendo la flama mucho rato. Me acuerdo de que pensé en cantarme</w:t>
+      </w:r>
+      <w:r>
+        <w:t xml:space="preserve"> </w:t>
+      </w:r>
+      <w:r>
+        <w:t xml:space="preserve">“</w:t>
+      </w:r>
+      <w:r>
+        <w:t xml:space="preserve">las mañanitas</w:t>
+      </w:r>
+      <w:r>
+        <w:t xml:space="preserve">”</w:t>
+      </w:r>
+      <w:r>
+        <w:t xml:space="preserve">, pero me dio vergüenza que se escuchara la voz, aunque no había nadie. Entonces la canté en la cabeza. Todas las estrofas. Hasta el final.</w:t>
+      </w:r>
+    </w:p>
+    <w:p>
+      <w:pPr>
+        <w:pStyle w:val="BodyText"/>
+      </w:pPr>
+      <w:r>
+        <w:t xml:space="preserve">Después pedí un deseo. Pedí que dejara de doler.</w:t>
+      </w:r>
+    </w:p>
+    <w:p>
+      <w:pPr>
+        <w:pStyle w:val="BodyText"/>
+      </w:pPr>
+      <w:r>
+        <w:t xml:space="preserve">Soplé. La flama se apagó. Una hebra de humo subió hacia el foco y se deshizo.</w:t>
+      </w:r>
+    </w:p>
+    <w:p>
+      <w:pPr>
+        <w:pStyle w:val="BodyText"/>
+      </w:pPr>
+      <w:r>
+        <w:t xml:space="preserve">Y no pasó nada. Me comí la concha en tres mordidas, con la vela todavía clavada, y subí a mi cuarto.</w:t>
+      </w:r>
+    </w:p>
+    <w:p>
+      <w:pPr>
+        <w:pStyle w:val="BodyText"/>
+      </w:pPr>
+      <w:r>
+        <w:t xml:space="preserve">Así cumplí dieciocho años. Ya soy adulto, según dicen. Nadie me lo dijo en persona, pero lo dicen.</w:t>
+      </w:r>
+    </w:p>
+    <w:p>
+      <w:pPr>
+        <w:pStyle w:val="BodyText"/>
+      </w:pPr>
+      <w:r>
+        <w:t xml:space="preserve">Esta mañana encontré este cuaderno en el fondo de un cajón. Era de la prepa. Tenía las primeras seis hojas llenas de apuntes de química y el resto en blanco. Arranqué las seis hojas, las tiré, y me quedé con el resto. Es azul, de pasta blanda, con una esquina doblada porque se me cayó una vez en el camión. No es nada especial. Pero era lo que tenía a la mano.</w:t>
       </w:r>
     </w:p>
     <w:p>
@@ -122,7 +227,7 @@
         <w:t xml:space="preserve"> </w:t>
       </w:r>
       <w:r>
-        <w:t xml:space="preserve">ayudaba. Me dio una hoja con ejercicios de respiración, con un dibujo de un gatito colgado de una rama que decía</w:t>
+        <w:t xml:space="preserve">ayudaba. Me dio una hoja con ejercicios de respiración y un dibujo de un gatito colgado de una rama, con una frase que decía</w:t>
       </w:r>
       <w:r>
         <w:t xml:space="preserve"> </w:t>
@@ -149,7 +254,7 @@
         <w:t xml:space="preserve">”</w:t>
       </w:r>
       <w:r>
-        <w:t xml:space="preserve">. Nunca volví. No porque fuera mala persona; al contrario, era un hombre amable, con la voz suave y los ojos cansados. Es que cuando me senté en esa silla que rechinaba sentí las ganas de llorar y de reírme al mismo tiempo, y no me salió ninguna de las dos. Me quedé en blanco, con la boca abierta, como un pez. Cuando eso me pasa, mejor me quedo callado.</w:t>
+        <w:t xml:space="preserve">. Nunca volví. No porque fuera mala persona; era un hombre amable, con voz suave y ojos cansados. Es que cuando me senté en esa silla que rechinaba sentí ganas de llorar y de reírme al mismo tiempo, y no me salió ninguna de las dos. Me quedé en blanco, con la boca medio abierta. Cuando eso me pasa, mejor me callo.</w:t>
       </w:r>
     </w:p>
     <w:p>
@@ -192,89 +297,54 @@
         <w:pStyle w:val="BodyText"/>
       </w:pPr>
       <w:r>
-        <w:t xml:space="preserve">Hoy me desperté a las diez y media, porque ya no tengo motivo para despertarme antes. Mi vida tenía forma hasta hace unos meses: el uniforme, el camión, los pasillos, el recreo, las clases, la salida. Era una estructura que me sostenía sin que me diera cuenta, como las varillas dentro de una pared. Ahora la prepa terminó y la universidad no empieza hasta enero. Entre septiembre y enero hay un hueco enorme y yo caigo en él todos los días.</w:t>
-      </w:r>
-    </w:p>
-    <w:p>
-      <w:pPr>
-        <w:pStyle w:val="BodyText"/>
-      </w:pPr>
-      <w:r>
-        <w:t xml:space="preserve">Me quedé en la cama viendo el techo. Hay una mancha de humedad que a veces parece un perro y a veces una nube. Hoy parecía un perro. Lo miré hasta que dieron las doce, hasta que me dolió la espalda de tanto estar acostado, hasta que me di cuenta de que tenía hambre. Me comí unas galletas saladas con cajeta, de pie, frente al refrigerador abierto. Me gusta ese lugar. La luz fría, el zumbido, el aire en la cara. Es el único sitio de la casa donde nadie me pregunta nada y todo está iluminado.</w:t>
-      </w:r>
-    </w:p>
-    <w:p>
-      <w:pPr>
-        <w:pStyle w:val="BodyText"/>
-      </w:pPr>
-      <w:r>
-        <w:t xml:space="preserve">Mi mamá trabaja en una farmacia de veinticuatro horas. Sale a las ocho de la noche y regresa a las siete de la mañana. Hace años que vivimos así, cruzándonos como dos personas que comparten una casa en turnos distintos. A veces la escucho llegar: la llave, la puerta, sus pasos despacio para no despertarme, el sonido de la cafetera. Yo me hago el dormido. Me da pena que me vea despierto a esa hora, con los ojos hinchados, porque ella ya carga con demasiado y no quiero ser una piedra más en su espalda.</w:t>
-      </w:r>
-    </w:p>
-    <w:p>
-      <w:pPr>
-        <w:pStyle w:val="BodyText"/>
-      </w:pPr>
-      <w:r>
-        <w:t xml:space="preserve">Hoy me dejó una nota pegada con un imán de Acapulco:</w:t>
-      </w:r>
-    </w:p>
-    <w:p>
-      <w:pPr>
-        <w:pStyle w:val="BodyText"/>
-      </w:pPr>
-      <w:r>
-        <w:rPr>
-          <w:iCs/>
-          <w:i/>
-        </w:rPr>
+        <w:t xml:space="preserve">Hoy me desperté a las once, porque ya no tengo motivo para despertarme antes.</w:t>
+      </w:r>
+    </w:p>
+    <w:p>
+      <w:pPr>
+        <w:pStyle w:val="BodyText"/>
+      </w:pPr>
+      <w:r>
+        <w:t xml:space="preserve">Mi vida tenía forma hasta hace unos meses: el uniforme, el camión, los pasillos, las clases, la salida. Era una estructura que me sostenía sin que me diera cuenta, como las varillas dentro de una pared. Ahora la prepa terminó, la universidad no empieza hasta enero, y desde hace dos meses busco trabajo. Dos meses. Veintitrés lugares. Los conté.</w:t>
+      </w:r>
+    </w:p>
+    <w:p>
+      <w:pPr>
+        <w:pStyle w:val="BodyText"/>
+      </w:pPr>
+      <w:r>
+        <w:t xml:space="preserve">Entregué solicitudes en una taquería, en tres tiendas de conveniencia, en una papelería, en un autolavado, en una pizzería, en un súper. En la mayoría ni siquiera me recibieron el papel. Me dijeron</w:t>
+      </w:r>
+      <w:r>
+        <w:t xml:space="preserve"> </w:t>
+      </w:r>
+      <w:r>
         <w:t xml:space="preserve">“</w:t>
       </w:r>
       <w:r>
-        <w:rPr>
-          <w:iCs/>
-          <w:i/>
-        </w:rPr>
-        <w:t xml:space="preserve">David, hay frijoles en el refri. Come algo caliente. Te quiero mucho, hijo. —Mamá.</w:t>
-      </w:r>
-      <w:r>
-        <w:rPr>
-          <w:iCs/>
-          <w:i/>
-        </w:rPr>
+        <w:t xml:space="preserve">déjelo ahí, nosotros le llamamos</w:t>
+      </w:r>
+      <w:r>
         <w:t xml:space="preserve">”</w:t>
       </w:r>
-    </w:p>
-    <w:p>
-      <w:pPr>
-        <w:pStyle w:val="BodyText"/>
-      </w:pPr>
-      <w:r>
-        <w:t xml:space="preserve">La leí tres veces. Después la dejé ahí. No me animo a quitarla.</w:t>
-      </w:r>
-    </w:p>
-    <w:p>
-      <w:pPr>
-        <w:pStyle w:val="BodyText"/>
-      </w:pPr>
-      <w:r>
-        <w:t xml:space="preserve">Ese imán lo compró en un mercado hace años. Dijo que algún día íbamos a ir a Acapulco, los dos, a ver el mar. Yo creo que ya ni se acuerda de que lo dijo. Yo sí. Me acuerdo de todo lo que me prometen, aunque quienes lo prometieron lo hayan olvidado.</w:t>
-      </w:r>
-    </w:p>
-    <w:p>
-      <w:pPr>
-        <w:pStyle w:val="BodyText"/>
-      </w:pPr>
-      <w:r>
-        <w:t xml:space="preserve">Después de comer salí a caminar. No iba a ningún lado. Eso es lo que hago ahora: camino sin destino, con los audífonos puestos y sin música, solo para que la gente crea que estoy escuchando algo y no me hable. Pasé por la panadería, por el parque con las bancas pintadas de verde, por la cancha donde jugaba futbol con mis compañeros, esos que ya casi no me escriben.</w:t>
-      </w:r>
-    </w:p>
-    <w:p>
-      <w:pPr>
-        <w:pStyle w:val="BodyText"/>
-      </w:pPr>
-      <w:r>
-        <w:t xml:space="preserve">No se enojaron conmigo. Eso es lo que más me cuesta explicar. Nadie me hizo nada. Simplemente me fui apagando, poco a poco, y la gente se cansa de preguntarle a alguien que siempre responde</w:t>
+      <w:r>
+        <w:t xml:space="preserve">, y lo dejaron en un montón junto a otros veinte iguales. En una tienda de ropa me hicieron una entrevista. Fue la única. La encargada, una mujer joven con las uñas largas, me preguntó:</w:t>
+      </w:r>
+    </w:p>
+    <w:p>
+      <w:pPr>
+        <w:pStyle w:val="BodyText"/>
+      </w:pPr>
+      <w:r>
+        <w:t xml:space="preserve">—¿Y tú por qué quieres trabajar aquí?</w:t>
+      </w:r>
+    </w:p>
+    <w:p>
+      <w:pPr>
+        <w:pStyle w:val="BodyText"/>
+      </w:pPr>
+      <w:r>
+        <w:t xml:space="preserve">Yo me quedé callado. Me di cuenta de que no tenía una respuesta bonita. La verdad era que necesitaba el dinero, que necesitaba una razón para salir de la casa, que necesitaba que alguien me dijera que servía para algo. Pero eso no se dice en una entrevista. Así que dije</w:t>
       </w:r>
       <w:r>
         <w:t xml:space="preserve"> </w:t>
@@ -283,21 +353,101 @@
         <w:t xml:space="preserve">“</w:t>
       </w:r>
       <w:r>
-        <w:t xml:space="preserve">ando bien</w:t>
+        <w:t xml:space="preserve">porque me gusta la ropa</w:t>
       </w:r>
       <w:r>
         <w:t xml:space="preserve">”</w:t>
       </w:r>
       <w:r>
-        <w:t xml:space="preserve">. Un día dejaron de preguntar. Y ahora, cuando veo sus historias, los veo en fiestas, en el cine, en la playa, abrazados, riéndose, y yo del otro lado de la pantalla, como en una vitrina, mirando una vida que sigue sin mí.</w:t>
-      </w:r>
-    </w:p>
-    <w:p>
-      <w:pPr>
-        <w:pStyle w:val="BodyText"/>
-      </w:pPr>
-      <w:r>
-        <w:t xml:space="preserve">Hice un cálculo hoy. La última vez que alguien me mandó un mensaje que no fuera de mi mamá o de la compañía del celular fue hace nueve días. Un</w:t>
+        <w:t xml:space="preserve">, que es mentira, y ella sonrió con esa sonrisa de lástima que reconozco desde lejos.</w:t>
+      </w:r>
+    </w:p>
+    <w:p>
+      <w:pPr>
+        <w:pStyle w:val="BodyText"/>
+      </w:pPr>
+      <w:r>
+        <w:t xml:space="preserve">—Te hablamos —me dijo.</w:t>
+      </w:r>
+    </w:p>
+    <w:p>
+      <w:pPr>
+        <w:pStyle w:val="BodyText"/>
+      </w:pPr>
+      <w:r>
+        <w:t xml:space="preserve">No me hablaron.</w:t>
+      </w:r>
+    </w:p>
+    <w:p>
+      <w:pPr>
+        <w:pStyle w:val="BodyText"/>
+      </w:pPr>
+      <w:r>
+        <w:t xml:space="preserve">Hay un tipo de humillación que no hace ruido. No es que te griten, ni que te insulten. Es que te miran un segundo, calculan cuánto vales, y deciden que no es suficiente. Y tú te vas a tu casa sabiendo que tenían razón.</w:t>
+      </w:r>
+    </w:p>
+    <w:p>
+      <w:pPr>
+        <w:pStyle w:val="BodyText"/>
+      </w:pPr>
+      <w:r>
+        <w:t xml:space="preserve">Hoy fui a una taquería a preguntar por segunda vez, porque la primera vez el dueño me dijo que regresara en una semana. Regresé. El dueño estaba con otros dos señores, tomando refresco en una mesa del fondo. Me vio entrar. Se rió, y les dijo algo en voz baja. Los tres voltearon a verme. Uno de ellos dijo, sin esconderse:</w:t>
+      </w:r>
+    </w:p>
+    <w:p>
+      <w:pPr>
+        <w:pStyle w:val="BodyText"/>
+      </w:pPr>
+      <w:r>
+        <w:t xml:space="preserve">—¿Este es el que viene a pedir chamba? ¿El flaquito?</w:t>
+      </w:r>
+    </w:p>
+    <w:p>
+      <w:pPr>
+        <w:pStyle w:val="BodyText"/>
+      </w:pPr>
+      <w:r>
+        <w:t xml:space="preserve">Y se rieron.</w:t>
+      </w:r>
+    </w:p>
+    <w:p>
+      <w:pPr>
+        <w:pStyle w:val="BodyText"/>
+      </w:pPr>
+      <w:r>
+        <w:t xml:space="preserve">El dueño me dijo que no había vacante, que ya se había llenado. Pero la vacante seguía en el cartel de la puerta. La vi al salir. Se me quedó clavada en los ojos, con su letra de plumón rojo, mientras caminaba a mi casa con las manos en los bolsillos y la cara caliente.</w:t>
+      </w:r>
+    </w:p>
+    <w:p>
+      <w:pPr>
+        <w:pStyle w:val="BodyText"/>
+      </w:pPr>
+      <w:r>
+        <w:t xml:space="preserve">No lloré. Eso ya se me acabó, creo. Los ojos tienen un límite, y los míos ya lo rebasaron hace tiempo. Lo que sentí fue otra cosa. Fue como si algo en mi cuerpo se pusiera en pausa. Como cuando apagas la televisión y la pantalla se queda un segundo con el reflejo de la sala vacía.</w:t>
+      </w:r>
+    </w:p>
+    <w:p>
+      <w:pPr>
+        <w:pStyle w:val="BodyText"/>
+      </w:pPr>
+      <w:r>
+        <w:t xml:space="preserve">Me dije:</w:t>
+      </w:r>
+      <w:r>
+        <w:t xml:space="preserve"> </w:t>
+      </w:r>
+      <w:r>
+        <w:rPr>
+          <w:iCs/>
+          <w:i/>
+        </w:rPr>
+        <w:t xml:space="preserve">eres una basura, David.</w:t>
+      </w:r>
+      <w:r>
+        <w:t xml:space="preserve"> </w:t>
+      </w:r>
+      <w:r>
+        <w:t xml:space="preserve">Lo dije sin gritar, sin dramatismo, con la misma voz con la que uno dice</w:t>
       </w:r>
       <w:r>
         <w:t xml:space="preserve"> </w:t>
@@ -306,24 +456,165 @@
         <w:t xml:space="preserve">“</w:t>
       </w:r>
       <w:r>
-        <w:t xml:space="preserve">jaja qué onda</w:t>
+        <w:t xml:space="preserve">ya es tarde</w:t>
       </w:r>
       <w:r>
         <w:t xml:space="preserve">”</w:t>
       </w:r>
       <w:r>
-        <w:t xml:space="preserve"> </w:t>
-      </w:r>
-      <w:r>
-        <w:t xml:space="preserve">de Chuy, del equipo. Le contesté con un emoji. Ahí quedó.</w:t>
-      </w:r>
-    </w:p>
-    <w:p>
-      <w:pPr>
-        <w:pStyle w:val="BodyText"/>
-      </w:pPr>
-      <w:r>
-        <w:t xml:space="preserve">Nueve días. Me pregunté cuántos más tendrían que pasar para que alguien notara que no estoy. Y después me dio vergüenza haberlo pensado.</w:t>
+        <w:t xml:space="preserve">. Y lo peor es que no me dolió. Se sintió como un dato. Como leer el nombre en una credencial.</w:t>
+      </w:r>
+    </w:p>
+    <w:p>
+      <w:pPr>
+        <w:pStyle w:val="BodyText"/>
+      </w:pPr>
+      <w:r>
+        <w:t xml:space="preserve">Llegué a la casa. Mi hermano estaba en la sala, con los pies en la mesa, viendo su celular. Iván tiene veinticuatro años. Trabaja en una agencia de autos, gana bien, tiene novia, tiene moto, tiene todo lo que mi mamá pidió alguna vez que sus hijos tuvieran. Yo lo admiré mucho de niño. Lo seguía por toda la casa. Quería ser como él.</w:t>
+      </w:r>
+    </w:p>
+    <w:p>
+      <w:pPr>
+        <w:pStyle w:val="BodyText"/>
+      </w:pPr>
+      <w:r>
+        <w:t xml:space="preserve">Lo saludé. No contestó. Le dije:</w:t>
+      </w:r>
+    </w:p>
+    <w:p>
+      <w:pPr>
+        <w:pStyle w:val="BodyText"/>
+      </w:pPr>
+      <w:r>
+        <w:t xml:space="preserve">—Fui a buscar trabajo otra vez.</w:t>
+      </w:r>
+    </w:p>
+    <w:p>
+      <w:pPr>
+        <w:pStyle w:val="BodyText"/>
+      </w:pPr>
+      <w:r>
+        <w:t xml:space="preserve">Él ni siquiera levantó los ojos.</w:t>
+      </w:r>
+    </w:p>
+    <w:p>
+      <w:pPr>
+        <w:pStyle w:val="BodyText"/>
+      </w:pPr>
+      <w:r>
+        <w:t xml:space="preserve">—¿Y? —dijo.</w:t>
+      </w:r>
+    </w:p>
+    <w:p>
+      <w:pPr>
+        <w:pStyle w:val="BodyText"/>
+      </w:pPr>
+      <w:r>
+        <w:t xml:space="preserve">—Nada. No me quisieron.</w:t>
+      </w:r>
+    </w:p>
+    <w:p>
+      <w:pPr>
+        <w:pStyle w:val="BodyText"/>
+      </w:pPr>
+      <w:r>
+        <w:t xml:space="preserve">Entonces sí me miró. Me miró de arriba abajo, despacio, como se mira un mueble que se echó a perder.</w:t>
+      </w:r>
+    </w:p>
+    <w:p>
+      <w:pPr>
+        <w:pStyle w:val="BodyText"/>
+      </w:pPr>
+      <w:r>
+        <w:t xml:space="preserve">—Es que no sirves para nada, David —dijo—. Mira nada más cómo andas. Así no te va a contratar nadie. Aprende a hablar, a pararte derecho. Eres un inútil.</w:t>
+      </w:r>
+    </w:p>
+    <w:p>
+      <w:pPr>
+        <w:pStyle w:val="BodyText"/>
+      </w:pPr>
+      <w:r>
+        <w:t xml:space="preserve">Lo dijo sin rabia. Ese fue el detalle. Lo dijo con la misma calma con la que me habría pedido que le pasara el control remoto. Como quien dice una verdad que ya todos saben y que nadie ha querido decirte.</w:t>
+      </w:r>
+    </w:p>
+    <w:p>
+      <w:pPr>
+        <w:pStyle w:val="BodyText"/>
+      </w:pPr>
+      <w:r>
+        <w:t xml:space="preserve">Yo no respondí. Subí a mi cuarto y cerré la puerta con mucho cuidado, para que no se oyera el golpe.</w:t>
+      </w:r>
+    </w:p>
+    <w:p>
+      <w:pPr>
+        <w:pStyle w:val="BodyText"/>
+      </w:pPr>
+      <w:r>
+        <w:t xml:space="preserve">Más tarde, ya de noche, escuché a mi mamá hablando con él en la cocina. No quise escuchar, pero las paredes de esta casa son de papel. Ella le preguntaba cómo le había ido en el trabajo. Él le contó que lo habían felicitado. Ella se rió, con esa risa clara que ya casi no le conozco, y le dijo:</w:t>
+      </w:r>
+      <w:r>
+        <w:t xml:space="preserve"> </w:t>
+      </w:r>
+      <w:r>
+        <w:rPr>
+          <w:iCs/>
+          <w:i/>
+        </w:rPr>
+        <w:t xml:space="preserve">“</w:t>
+      </w:r>
+      <w:r>
+        <w:rPr>
+          <w:iCs/>
+          <w:i/>
+        </w:rPr>
+        <w:t xml:space="preserve">Qué orgullo, hijo. Tú sí eres mi apoyo.</w:t>
+      </w:r>
+      <w:r>
+        <w:rPr>
+          <w:iCs/>
+          <w:i/>
+        </w:rPr>
+        <w:t xml:space="preserve">”</w:t>
+      </w:r>
+    </w:p>
+    <w:p>
+      <w:pPr>
+        <w:pStyle w:val="BodyText"/>
+      </w:pPr>
+      <w:r>
+        <w:rPr>
+          <w:iCs/>
+          <w:i/>
+        </w:rPr>
+        <w:t xml:space="preserve">Tú sí.</w:t>
+      </w:r>
+    </w:p>
+    <w:p>
+      <w:pPr>
+        <w:pStyle w:val="BodyText"/>
+      </w:pPr>
+      <w:r>
+        <w:t xml:space="preserve">Me quedé en la oscuridad, con la oreja pegada a la pared como un niño que escucha una fiesta a la que no lo invitaron. Pensé que en esas dos palabras cabía todo. Que mi mamá no lo dijo con mala intención, que seguramente ni siquiera se dio cuenta de lo que dijo. Pero lo dijo. Y yo lo escuché. Y ahora ya no puedo desescucharlo.</w:t>
+      </w:r>
+    </w:p>
+    <w:p>
+      <w:pPr>
+        <w:pStyle w:val="BodyText"/>
+      </w:pPr>
+      <w:r>
+        <w:rPr>
+          <w:iCs/>
+          <w:i/>
+        </w:rPr>
+        <w:t xml:space="preserve">Tú sí.</w:t>
+      </w:r>
+    </w:p>
+    <w:p>
+      <w:pPr>
+        <w:pStyle w:val="BodyText"/>
+      </w:pPr>
+      <w:r>
+        <w:t xml:space="preserve">Entonces, ¿yo no?</w:t>
       </w:r>
     </w:p>
     <w:p>
@@ -350,23 +641,15 @@
         <w:pStyle w:val="BodyText"/>
       </w:pPr>
       <w:r>
-        <w:t xml:space="preserve">Ya sabía que tarde o temprano llegaría a esto. Llevo todo el día esquivándolo, escribiendo de cualquier cosa, de la cajeta, del techo, de la nota de mi mamá, para no tener que sentarme frente al nombre.</w:t>
-      </w:r>
-    </w:p>
-    <w:p>
-      <w:pPr>
-        <w:pStyle w:val="BodyText"/>
-      </w:pPr>
-      <w:r>
-        <w:t xml:space="preserve">Nayeli.</w:t>
-      </w:r>
-    </w:p>
-    <w:p>
-      <w:pPr>
-        <w:pStyle w:val="BodyText"/>
-      </w:pPr>
-      <w:r>
-        <w:t xml:space="preserve">Ya lo escribí. Ahí está, en la hoja, con sus siete letras, y no pasó nada. El techo no se cayó. Pero la mano me tiembla un poco.</w:t>
+        <w:t xml:space="preserve">Tengo que hablar de Nayeli. Llevo todo el día esquivándola. Escribiendo de cualquier otra cosa, del trabajo, de mi hermano, de la concha, para no tener que sentarme frente al nombre.</w:t>
+      </w:r>
+    </w:p>
+    <w:p>
+      <w:pPr>
+        <w:pStyle w:val="BodyText"/>
+      </w:pPr>
+      <w:r>
+        <w:t xml:space="preserve">Ya lo escribí. Ahí está. No pasó nada. El techo no se cayó. Pero la mano me tiembla.</w:t>
       </w:r>
     </w:p>
     <w:p>
@@ -398,7 +681,7 @@
         <w:pStyle w:val="BodyText"/>
       </w:pPr>
       <w:r>
-        <w:t xml:space="preserve">Me reí. Fue la primera vez en meses que me reía de verdad. Y así, de la forma más simple del mundo, sin música ni nada, me gustó.</w:t>
+        <w:t xml:space="preserve">Me reí. Fue la primera vez en meses que me reía de verdad. Y así, de la manera más simple del mundo, me gustó.</w:t>
       </w:r>
     </w:p>
     <w:p>
@@ -414,15 +697,15 @@
         <w:pStyle w:val="BodyText"/>
       </w:pPr>
       <w:r>
-        <w:t xml:space="preserve">La quise bien. No digo que fui perfecto, porque no lo fui. Era celoso a veces, y callado, y me encerraba en mi cabeza y no le decía lo que sentía. Pero la quise con todo lo que tenía, que no era mucho, pero era todo. Le escribía cartas. Le guardaba lugar en el camión. Me aprendí la canción que le gustaba y se la canté mal, desafinado, en la azotea de mi casa, mientras ella se tapaba la cara con las manos de tanta risa.</w:t>
-      </w:r>
-    </w:p>
-    <w:p>
-      <w:pPr>
-        <w:pStyle w:val="BodyText"/>
-      </w:pPr>
-      <w:r>
-        <w:t xml:space="preserve">Yo pensaba que aquello iba a durar. Esa es la parte tonta. No lo pensaba como esperanza, lo pensaba como un hecho, igual que uno piensa que mañana va a salir el sol. Hacía planes. Vivir en la misma ciudad, estudiar cerca, un departamento chico con una planta en la ventana. Nunca se lo dije en voz alta, por pena, pero en mi cabeza ya lo había decorado todo.</w:t>
+        <w:t xml:space="preserve">La quise bien. No digo que fui perfecto, porque no lo fui. Era celoso a veces, y callado, y me encerraba en mi cabeza sin decirle lo que sentía. Pero la quise con todo lo que tenía, que no era mucho, pero era todo. Le escribía cartas. Le guardaba lugar en el camión. Le pagaba el helado cuando a ella se le olvidaba la cartera, aunque a mí tampoco me sobraba. Me aprendí la canción que le gustaba y se la canté mal, desafinado, en la azotea de mi casa, mientras ella se tapaba la cara con las manos de tanta risa.</w:t>
+      </w:r>
+    </w:p>
+    <w:p>
+      <w:pPr>
+        <w:pStyle w:val="BodyText"/>
+      </w:pPr>
+      <w:r>
+        <w:t xml:space="preserve">Yo pensaba que aquello iba a durar. Esa es la parte tonta. No lo pensaba como esperanza, lo pensaba como un hecho, igual que uno piensa que mañana va a salir el sol. Hacía planes. Una ciudad, un departamento chico, una planta en la ventana. Nunca se lo dije en voz alta, por pena. Pero en mi cabeza ya lo había decorado todo.</w:t>
       </w:r>
     </w:p>
     <w:p>
@@ -438,23 +721,23 @@
         <w:pStyle w:val="BodyText"/>
       </w:pPr>
       <w:r>
-        <w:t xml:space="preserve">Sí, llevo la cuenta. Qué patético. Pero la cuenta se lleva sola; la mente es una libreta que sigue anotando aunque uno ya no quiera leerla.</w:t>
-      </w:r>
-    </w:p>
-    <w:p>
-      <w:pPr>
-        <w:pStyle w:val="BodyText"/>
-      </w:pPr>
-      <w:r>
-        <w:t xml:space="preserve">Nos vimos en la banca verde del parque. La misma que pasé hoy sin atreverme a mirar. Era un jueves de tarde, hacía un poco de viento y el cielo estaba de ese color gris que no promete lluvia ni sol. Ella llegó con las mangas ya jaladas sobre las manos. En ese momento lo supe. Uno siempre sabe, aunque finja que no.</w:t>
-      </w:r>
-    </w:p>
-    <w:p>
-      <w:pPr>
-        <w:pStyle w:val="BodyText"/>
-      </w:pPr>
-      <w:r>
-        <w:t xml:space="preserve">No lloró. Eso fue lo que más me dolió. Yo esperaba que llorara, porque eso habría significado que le costaba, que yo había sido algo importante, algo que valía la pena llorar. Pero estaba tranquila. Mirando el piso. Con la voz de alguien que ya practicó lo que va a decir.</w:t>
+        <w:t xml:space="preserve">Sí, llevo la cuenta. Qué patético. Pero la cuenta se lleva sola. La mente es una libreta que sigue anotando aunque uno ya no quiera leerla.</w:t>
+      </w:r>
+    </w:p>
+    <w:p>
+      <w:pPr>
+        <w:pStyle w:val="BodyText"/>
+      </w:pPr>
+      <w:r>
+        <w:t xml:space="preserve">Nos vimos en la banca verde del parque. Era un jueves de tarde, con viento y un cielo gris que no prometía ni lluvia ni sol. Ella llegó con las mangas ya jaladas sobre las manos. En ese momento lo supe. Uno siempre sabe, aunque finja que no.</w:t>
+      </w:r>
+    </w:p>
+    <w:p>
+      <w:pPr>
+        <w:pStyle w:val="BodyText"/>
+      </w:pPr>
+      <w:r>
+        <w:t xml:space="preserve">No lloró. Eso fue lo que más me dolió. Yo esperaba que llorara, porque eso habría significado que le costaba, que yo había sido algo que valía la pena llorar. Pero estaba tranquila, mirando el piso, con la voz de alguien que ya ensayó lo que va a decir.</w:t>
       </w:r>
     </w:p>
     <w:p>
@@ -494,7 +777,7 @@
         <w:pStyle w:val="BodyText"/>
       </w:pPr>
       <w:r>
-        <w:t xml:space="preserve">Se llama Emiliano. Va un año arriba de nosotros. Toca la guitarra, tiene una moto, tiene esa clase de seguridad que yo no he tenido nunca ni dormido. Lo había visto en los pasillos y siempre pensé:</w:t>
+        <w:t xml:space="preserve">Se llama Emiliano. Va un año arriba de nosotros. Toca la guitarra, tiene una moto, tiene esa clase de seguridad que yo nunca he tenido ni dormido. Lo había visto en los pasillos y siempre pensé:</w:t>
       </w:r>
       <w:r>
         <w:t xml:space="preserve"> </w:t>
@@ -506,19 +789,13 @@
         </w:rPr>
         <w:t xml:space="preserve">ese es de otra liga.</w:t>
       </w:r>
-      <w:r>
-        <w:t xml:space="preserve"> </w:t>
-      </w:r>
-      <w:r>
-        <w:t xml:space="preserve">Jamás se me ocurrió que su liga y la mía pudieran competir por la misma persona. Y la verdad es que no competimos. No hubo pelea. Yo ni siquiera supe que había una.</w:t>
-      </w:r>
-    </w:p>
-    <w:p>
-      <w:pPr>
-        <w:pStyle w:val="BodyText"/>
-      </w:pPr>
-      <w:r>
-        <w:t xml:space="preserve">No dije nada más. Ni</w:t>
+    </w:p>
+    <w:p>
+      <w:pPr>
+        <w:pStyle w:val="BodyText"/>
+      </w:pPr>
+      <w:r>
+        <w:t xml:space="preserve">Yo me quedé ahí sentado, sin decir</w:t>
       </w:r>
       <w:r>
         <w:t xml:space="preserve"> </w:t>
@@ -563,7 +840,7 @@
         <w:t xml:space="preserve">”</w:t>
       </w:r>
       <w:r>
-        <w:t xml:space="preserve">. Me quedé ahí sentado, escuchando cómo se me rompía algo por dentro, tan despacio que casi no hacía ruido. Como un vaso con una grieta: no lo oyes caer, solo ves cómo se va abriendo.</w:t>
+        <w:t xml:space="preserve">. Escuchando cómo se me rompía algo por dentro, tan despacio que casi no hacía ruido. Como un vaso con una grieta: no lo oyes caer, solo ves cómo se va abriendo.</w:t>
       </w:r>
     </w:p>
     <w:p>
@@ -594,64 +871,211 @@
         <w:pStyle w:val="BodyText"/>
       </w:pPr>
       <w:r>
-        <w:t xml:space="preserve">Yo me quedé en esa banca hasta que oscureció, hasta que se prendieron las farolas una por una, hasta que un señor que barría las hojas me dijo</w:t>
-      </w:r>
-      <w:r>
-        <w:t xml:space="preserve"> </w:t>
-      </w:r>
-      <w:r>
+        <w:t xml:space="preserve">Pero eso no fue lo peor. Lo peor lo supe después.</w:t>
+      </w:r>
+    </w:p>
+    <w:p>
+      <w:pPr>
+        <w:pStyle w:val="BodyText"/>
+      </w:pPr>
+      <w:r>
+        <w:t xml:space="preserve">Dos semanas más tarde, en el recreo, escuché sin querer a unos compañeros hablando en el pasillo. Reían. Uno de ellos dijo:</w:t>
+      </w:r>
+      <w:r>
+        <w:t xml:space="preserve"> </w:t>
+      </w:r>
+      <w:r>
+        <w:rPr>
+          <w:iCs/>
+          <w:i/>
+        </w:rPr>
         <w:t xml:space="preserve">“</w:t>
       </w:r>
       <w:r>
-        <w:t xml:space="preserve">ya es tarde, joven, ya váyase a su casa</w:t>
-      </w:r>
-      <w:r>
+        <w:rPr>
+          <w:iCs/>
+          <w:i/>
+        </w:rPr>
+        <w:t xml:space="preserve">Pobre David, es que Nayeli ya andaba con Emiliano desde hace meses, ¿no? Desde antes de las vacaciones.</w:t>
+      </w:r>
+      <w:r>
+        <w:rPr>
+          <w:iCs/>
+          <w:i/>
+        </w:rPr>
         <w:t xml:space="preserve">”</w:t>
       </w:r>
-      <w:r>
-        <w:t xml:space="preserve">. Entonces caminé de regreso. Y desde esa noche, todas las noches, tengo la misma sensación: un hueco en el pecho con la forma exacta de ella.</w:t>
-      </w:r>
-    </w:p>
-    <w:p>
-      <w:pPr>
-        <w:pStyle w:val="BodyText"/>
-      </w:pPr>
-      <w:r>
-        <w:t xml:space="preserve">Hay gente que se acostumbra al dolor. Yo no. Yo solo aprendí a cargarlo sin que se note. Es distinto. Es como llevar una piedra en el bolsillo: de lejos nadie la ve, pero tú sabes que está ahí, que pesa, que te jala el cuerpo hacia un lado cada vez que caminas.</w:t>
-      </w:r>
-    </w:p>
-    <w:p>
-      <w:pPr>
-        <w:pStyle w:val="BodyText"/>
-      </w:pPr>
-      <w:r>
-        <w:t xml:space="preserve">Nunca se lo conté a nadie. Ni a mi mamá, que lo habrá notado, pero nunca preguntó, o preguntó y yo respondí</w:t>
-      </w:r>
-      <w:r>
-        <w:t xml:space="preserve"> </w:t>
-      </w:r>
-      <w:r>
+    </w:p>
+    <w:p>
+      <w:pPr>
+        <w:pStyle w:val="BodyText"/>
+      </w:pPr>
+      <w:r>
+        <w:t xml:space="preserve">Otro respondió:</w:t>
+      </w:r>
+      <w:r>
+        <w:t xml:space="preserve"> </w:t>
+      </w:r>
+      <w:r>
+        <w:rPr>
+          <w:iCs/>
+          <w:i/>
+        </w:rPr>
         <w:t xml:space="preserve">“</w:t>
       </w:r>
       <w:r>
-        <w:t xml:space="preserve">estoy bien</w:t>
-      </w:r>
-      <w:r>
+        <w:rPr>
+          <w:iCs/>
+          <w:i/>
+        </w:rPr>
+        <w:t xml:space="preserve">Sí, todos lo sabíamos. Hasta Chuy.</w:t>
+      </w:r>
+      <w:r>
+        <w:rPr>
+          <w:iCs/>
+          <w:i/>
+        </w:rPr>
         <w:t xml:space="preserve">”</w:t>
       </w:r>
-      <w:r>
-        <w:t xml:space="preserve"> </w:t>
-      </w:r>
-      <w:r>
-        <w:t xml:space="preserve">con esa cara de pared con la que ya respondo todo.</w:t>
-      </w:r>
-    </w:p>
-    <w:p>
-      <w:pPr>
-        <w:pStyle w:val="BodyText"/>
-      </w:pPr>
-      <w:r>
-        <w:t xml:space="preserve">Hasta ahora. A esta hoja.</w:t>
+    </w:p>
+    <w:p>
+      <w:pPr>
+        <w:pStyle w:val="BodyText"/>
+      </w:pPr>
+      <w:r>
+        <w:t xml:space="preserve">Y se rieron otra vez.</w:t>
+      </w:r>
+    </w:p>
+    <w:p>
+      <w:pPr>
+        <w:pStyle w:val="BodyText"/>
+      </w:pPr>
+      <w:r>
+        <w:t xml:space="preserve">Me quedé congelado detrás de una columna. Recuerdo que tenía una botella de agua en la mano y que se me resbaló, y que el ruido contra el piso fue lo único que se escuchó. Ellos voltearon, me vieron, y se quedaron callados. Nadie dijo nada. Nadie me dijo</w:t>
+      </w:r>
+      <w:r>
+        <w:t xml:space="preserve"> </w:t>
+      </w:r>
+      <w:r>
+        <w:t xml:space="preserve">“</w:t>
+      </w:r>
+      <w:r>
+        <w:t xml:space="preserve">perdón</w:t>
+      </w:r>
+      <w:r>
+        <w:t xml:space="preserve">”</w:t>
+      </w:r>
+      <w:r>
+        <w:t xml:space="preserve">, ni</w:t>
+      </w:r>
+      <w:r>
+        <w:t xml:space="preserve"> </w:t>
+      </w:r>
+      <w:r>
+        <w:t xml:space="preserve">“</w:t>
+      </w:r>
+      <w:r>
+        <w:t xml:space="preserve">te lo íbamos a decir</w:t>
+      </w:r>
+      <w:r>
+        <w:t xml:space="preserve">”</w:t>
+      </w:r>
+      <w:r>
+        <w:t xml:space="preserve">, ni</w:t>
+      </w:r>
+      <w:r>
+        <w:t xml:space="preserve"> </w:t>
+      </w:r>
+      <w:r>
+        <w:t xml:space="preserve">“</w:t>
+      </w:r>
+      <w:r>
+        <w:t xml:space="preserve">no sabíamos cómo</w:t>
+      </w:r>
+      <w:r>
+        <w:t xml:space="preserve">”</w:t>
+      </w:r>
+      <w:r>
+        <w:t xml:space="preserve">. Solo me miraron. Y después fingieron seguir con su plática.</w:t>
+      </w:r>
+    </w:p>
+    <w:p>
+      <w:pPr>
+        <w:pStyle w:val="BodyText"/>
+      </w:pPr>
+      <w:r>
+        <w:t xml:space="preserve">Todos lo sabían. Durante meses. Mientras yo le escribía cartas, mientras la esperaba a la salida, mientras le pagaba el helado, mientras planeaba un departamento con una planta en la ventana, todos lo sabían. Se sentaban conmigo en el recreo. Me preguntaban cómo iba todo. Me decían</w:t>
+      </w:r>
+      <w:r>
+        <w:t xml:space="preserve"> </w:t>
+      </w:r>
+      <w:r>
+        <w:t xml:space="preserve">“</w:t>
+      </w:r>
+      <w:r>
+        <w:t xml:space="preserve">qué bueno que tú y Nayeli están tan bien</w:t>
+      </w:r>
+      <w:r>
+        <w:t xml:space="preserve">”</w:t>
+      </w:r>
+      <w:r>
+        <w:t xml:space="preserve">. Y por dentro se burlaban.</w:t>
+      </w:r>
+    </w:p>
+    <w:p>
+      <w:pPr>
+        <w:pStyle w:val="BodyText"/>
+      </w:pPr>
+      <w:r>
+        <w:t xml:space="preserve">Fui el chiste. El último en enterarse. El tonto de la historia.</w:t>
+      </w:r>
+    </w:p>
+    <w:p>
+      <w:pPr>
+        <w:pStyle w:val="BodyText"/>
+      </w:pPr>
+      <w:r>
+        <w:t xml:space="preserve">Ahora entiendo por qué dejaron de hablarme. No porque yo me apagara. Se alejaron porque tenían vergüenza, o porque ya no les servía, o porque nunca fueron realmente mis amigos y lo único que hicieron fue acompañarme mientras yo les era útil, mientras les prestaba mis apuntes, mientras les pagaba el refresco, mientras me reía de sus chistes.</w:t>
+      </w:r>
+    </w:p>
+    <w:p>
+      <w:pPr>
+        <w:pStyle w:val="BodyText"/>
+      </w:pPr>
+      <w:r>
+        <w:t xml:space="preserve">Me usaron. Y yo lo permití, porque estaba tan solo que cualquier compañía, aunque fuera falsa, me parecía amor.</w:t>
+      </w:r>
+    </w:p>
+    <w:p>
+      <w:pPr>
+        <w:pStyle w:val="BodyText"/>
+      </w:pPr>
+      <w:r>
+        <w:t xml:space="preserve">Hay una frase que ya no me la quito de la cabeza:</w:t>
+      </w:r>
+      <w:r>
+        <w:t xml:space="preserve"> </w:t>
+      </w:r>
+      <w:r>
+        <w:rPr>
+          <w:iCs/>
+          <w:i/>
+        </w:rPr>
+        <w:t xml:space="preserve">jugaron conmigo.</w:t>
+      </w:r>
+      <w:r>
+        <w:t xml:space="preserve"> </w:t>
+      </w:r>
+      <w:r>
+        <w:t xml:space="preserve">Como se juega con un perro al que le lanzas la pelota para que corra, y cuando ya no quieres jugar la dejas en el pasto y te vas.</w:t>
+      </w:r>
+    </w:p>
+    <w:p>
+      <w:pPr>
+        <w:pStyle w:val="BodyText"/>
+      </w:pPr>
+      <w:r>
+        <w:t xml:space="preserve">Yo seguí ahí, con la lengua afuera, esperando que regresaran.</w:t>
       </w:r>
     </w:p>
     <w:p>
@@ -686,39 +1110,15 @@
         <w:pStyle w:val="BodyText"/>
       </w:pPr>
       <w:r>
-        <w:t xml:space="preserve">Estuve pensando en una cosa que me da vergüenza escribir, pero ya que esta hoja no va a juzgarme, la escribo: creo que lo que más extraño no es a Nayeli. Es sentirme elegido.</w:t>
-      </w:r>
-    </w:p>
-    <w:p>
-      <w:pPr>
-        <w:pStyle w:val="BodyText"/>
-      </w:pPr>
-      <w:r>
-        <w:t xml:space="preserve">Durante dos años y cuatro meses alguien me escogió, todos los días, entre todas las personas del mundo. Alguien me mandaba mensajes de buenos días, alguien esperaba mi respuesta, alguien se acordaba de mis cosas, de que no me gusta el cilantro, de que me da miedo manejar, de que a veces necesito silencio. Era alguien que sabía quién era yo. Y cuando se fue, se llevó consigo no solo su cariño, sino la prueba de que yo existía para alguien.</w:t>
-      </w:r>
-    </w:p>
-    <w:p>
-      <w:pPr>
-        <w:pStyle w:val="BodyText"/>
-      </w:pPr>
-      <w:r>
-        <w:t xml:space="preserve">Ahora nadie sabe quién soy. Ni yo mismo.</w:t>
-      </w:r>
-    </w:p>
-    <w:p>
-      <w:pPr>
-        <w:pStyle w:val="BodyText"/>
-      </w:pPr>
-      <w:r>
-        <w:t xml:space="preserve">A veces me miro en el espejo del baño y me cuesta reconocerme. Veo a un chico flaco, con ojeras, con el cabello sin peinar, con una mirada que parece estar siempre en otro lugar. Me pregunto si esa persona es la misma que cantaba mal en la azotea. Me pregunto en qué momento la perdí, o si se fue junto con ella.</w:t>
-      </w:r>
-    </w:p>
-    <w:p>
-      <w:pPr>
-        <w:pStyle w:val="BodyText"/>
-      </w:pPr>
-      <w:r>
-        <w:t xml:space="preserve">Y después viene la otra pregunta, la peor, la que no le he confesado a nadie. La pregunta de si fui yo. Si en algún punto hice algo, o dejé de hacerlo, que la empujó hacia otro lado. Ella dijo que no era por mí. Pero uno siempre sospecha que cuando alguien dice</w:t>
+        <w:t xml:space="preserve">Estuve pensando en mi papá.</w:t>
+      </w:r>
+    </w:p>
+    <w:p>
+      <w:pPr>
+        <w:pStyle w:val="BodyText"/>
+      </w:pPr>
+      <w:r>
+        <w:t xml:space="preserve">No lo había escrito porque me da vergüenza, pero ya que esta hoja no va a juzgarme, lo escribo. Mi papá se fue cuando yo tenía nueve años. No fue una pelea grande, no hubo gritos ni platos rotos. Un día dejó de llegar. Mi mamá dijo que estaba</w:t>
       </w:r>
       <w:r>
         <w:t xml:space="preserve"> </w:t>
@@ -727,13 +1127,13 @@
         <w:t xml:space="preserve">“</w:t>
       </w:r>
       <w:r>
-        <w:t xml:space="preserve">no eres tú</w:t>
+        <w:t xml:space="preserve">trabajando fuera</w:t>
       </w:r>
       <w:r>
         <w:t xml:space="preserve">”</w:t>
       </w:r>
       <w:r>
-        <w:t xml:space="preserve">, en realidad quiere decir</w:t>
+        <w:t xml:space="preserve">. Después dijo que</w:t>
       </w:r>
       <w:r>
         <w:t xml:space="preserve"> </w:t>
@@ -742,37 +1142,211 @@
         <w:t xml:space="preserve">“</w:t>
       </w:r>
       <w:r>
-        <w:t xml:space="preserve">no eres suficiente</w:t>
+        <w:t xml:space="preserve">ya veríamos</w:t>
       </w:r>
       <w:r>
         <w:t xml:space="preserve">”</w:t>
       </w:r>
       <w:r>
-        <w:t xml:space="preserve">. Y yo, que ya venía creyendo eso desde antes de conocerla, lo acepté sin pelear.</w:t>
-      </w:r>
-    </w:p>
-    <w:p>
-      <w:pPr>
-        <w:pStyle w:val="BodyText"/>
-      </w:pPr>
-      <w:r>
-        <w:t xml:space="preserve">No es que quiera morirme. Quiero que eso quede escrito para que no se malinterprete, aunque nadie vaya a leerlo. Lo que quiero es que deje de pesar. Que el cuerpo se me sienta ligero otra vez, como cuando era niño y corría sin saber hacia dónde. Hay una diferencia enorme entre querer desaparecer y querer descansar, y no siempre sé en cuál de las dos estoy parado.</w:t>
-      </w:r>
-    </w:p>
-    <w:p>
-      <w:pPr>
-        <w:pStyle w:val="BodyText"/>
-      </w:pPr>
-      <w:r>
-        <w:t xml:space="preserve">Hay noches en que el cansancio es tan grande que no se quita durmiendo. Es un cansancio de adentro, de algo que ya no tiene fuerzas para seguir fingiendo. Fingir que estoy bien. Fingir que tengo planes. Fingir que me interesa la universidad, el futuro, las pláticas de la gente. Fingir me agotó más que cualquier otra cosa que haya hecho en mi vida.</w:t>
-      </w:r>
-    </w:p>
-    <w:p>
-      <w:pPr>
-        <w:pStyle w:val="BodyText"/>
-      </w:pPr>
-      <w:r>
-        <w:t xml:space="preserve">Tal vez por eso escribo. Porque aquí no tengo que fingir.</w:t>
+        <w:t xml:space="preserve">. Después dejó de decir cualquier cosa.</w:t>
+      </w:r>
+    </w:p>
+    <w:p>
+      <w:pPr>
+        <w:pStyle w:val="BodyText"/>
+      </w:pPr>
+      <w:r>
+        <w:t xml:space="preserve">Pero hay una noche que no se me olvida.</w:t>
+      </w:r>
+    </w:p>
+    <w:p>
+      <w:pPr>
+        <w:pStyle w:val="BodyText"/>
+      </w:pPr>
+      <w:r>
+        <w:t xml:space="preserve">El día de mi cumpleaños número diez, me prometió que iba a venir. Me lo prometió por teléfono, con una voz alegre que yo no le conocía. Me dijo:</w:t>
+      </w:r>
+      <w:r>
+        <w:t xml:space="preserve"> </w:t>
+      </w:r>
+      <w:r>
+        <w:rPr>
+          <w:iCs/>
+          <w:i/>
+        </w:rPr>
+        <w:t xml:space="preserve">“</w:t>
+      </w:r>
+      <w:r>
+        <w:rPr>
+          <w:iCs/>
+          <w:i/>
+        </w:rPr>
+        <w:t xml:space="preserve">Voy a llevarte algo, campeón. Espérame afuera a las seis.</w:t>
+      </w:r>
+      <w:r>
+        <w:rPr>
+          <w:iCs/>
+          <w:i/>
+        </w:rPr>
+        <w:t xml:space="preserve">”</w:t>
+      </w:r>
+    </w:p>
+    <w:p>
+      <w:pPr>
+        <w:pStyle w:val="BodyText"/>
+      </w:pPr>
+      <w:r>
+        <w:t xml:space="preserve">Me puse mi camisa buena. La azul, la que me quedaba grande. Mi mamá me peinó con la mano mojada. Y me senté en la banqueta de enfrente de la casa, a las cinco y media, para no perderme su llegada.</w:t>
+      </w:r>
+    </w:p>
+    <w:p>
+      <w:pPr>
+        <w:pStyle w:val="BodyText"/>
+      </w:pPr>
+      <w:r>
+        <w:t xml:space="preserve">Esperé a las seis. Esperé a las siete. Pasó un carro blanco y pensé que era él. No era. Pasó una moto, no era. Pasó un señor con una bolsa de pan, no era.</w:t>
+      </w:r>
+    </w:p>
+    <w:p>
+      <w:pPr>
+        <w:pStyle w:val="BodyText"/>
+      </w:pPr>
+      <w:r>
+        <w:t xml:space="preserve">A las nueve, mi mamá salió y me dijo con la voz muy baja:</w:t>
+      </w:r>
+      <w:r>
+        <w:t xml:space="preserve"> </w:t>
+      </w:r>
+      <w:r>
+        <w:rPr>
+          <w:iCs/>
+          <w:i/>
+        </w:rPr>
+        <w:t xml:space="preserve">“</w:t>
+      </w:r>
+      <w:r>
+        <w:rPr>
+          <w:iCs/>
+          <w:i/>
+        </w:rPr>
+        <w:t xml:space="preserve">Vámonos para adentro, mi amor.</w:t>
+      </w:r>
+      <w:r>
+        <w:rPr>
+          <w:iCs/>
+          <w:i/>
+        </w:rPr>
+        <w:t xml:space="preserve">”</w:t>
+      </w:r>
+    </w:p>
+    <w:p>
+      <w:pPr>
+        <w:pStyle w:val="BodyText"/>
+      </w:pPr>
+      <w:r>
+        <w:t xml:space="preserve">Yo le dije que no. Que todavía faltaba. Que él iba a llegar.</w:t>
+      </w:r>
+    </w:p>
+    <w:p>
+      <w:pPr>
+        <w:pStyle w:val="BodyText"/>
+      </w:pPr>
+      <w:r>
+        <w:t xml:space="preserve">Ella se sentó a mi lado en la banqueta. No dijo nada. Solo se quedó ahí, en silencio, con la mano en mi espalda, hasta que yo mismo, solo, a las diez de la noche, entendí que no iba a venir. Y entonces me puse a llorar, tan fuerte que me dolía la panza, y ella me abrazó y me dijo</w:t>
+      </w:r>
+      <w:r>
+        <w:t xml:space="preserve"> </w:t>
+      </w:r>
+      <w:r>
+        <w:rPr>
+          <w:iCs/>
+          <w:i/>
+        </w:rPr>
+        <w:t xml:space="preserve">“</w:t>
+      </w:r>
+      <w:r>
+        <w:rPr>
+          <w:iCs/>
+          <w:i/>
+        </w:rPr>
+        <w:t xml:space="preserve">ya, ya, ya</w:t>
+      </w:r>
+      <w:r>
+        <w:rPr>
+          <w:iCs/>
+          <w:i/>
+        </w:rPr>
+        <w:t xml:space="preserve">”</w:t>
+      </w:r>
+      <w:r>
+        <w:t xml:space="preserve">, igual que se le dice a un niño que se cayó.</w:t>
+      </w:r>
+    </w:p>
+    <w:p>
+      <w:pPr>
+        <w:pStyle w:val="BodyText"/>
+      </w:pPr>
+      <w:r>
+        <w:t xml:space="preserve">Esa fue la última vez que mi mamá me abrazó así.</w:t>
+      </w:r>
+    </w:p>
+    <w:p>
+      <w:pPr>
+        <w:pStyle w:val="BodyText"/>
+      </w:pPr>
+      <w:r>
+        <w:t xml:space="preserve">Desde entonces, cada cumpleaños, una parte de mí sigue sentada en esa banqueta, con la camisa azul que me queda grande. Y creo que por eso este año, cuando prendí la velita en la cocina, no esperaba nada. Porque aprendí desde los diez años que esperar a alguien es la forma más lenta de romperse.</w:t>
+      </w:r>
+    </w:p>
+    <w:p>
+      <w:pPr>
+        <w:pStyle w:val="BodyText"/>
+      </w:pPr>
+      <w:r>
+        <w:t xml:space="preserve">Lo que no me di cuenta, hasta ahora, es que yo sigo esperando. Esperando a mi papá. Esperando a Nayeli. Esperando a que mis compañeros me escriban. Esperando a que mi mamá me mire como mira a mi hermano. Esperando a que alguien llegue a decirme</w:t>
+      </w:r>
+      <w:r>
+        <w:t xml:space="preserve"> </w:t>
+      </w:r>
+      <w:r>
+        <w:rPr>
+          <w:iCs/>
+          <w:i/>
+        </w:rPr>
+        <w:t xml:space="preserve">“</w:t>
+      </w:r>
+      <w:r>
+        <w:rPr>
+          <w:iCs/>
+          <w:i/>
+        </w:rPr>
+        <w:t xml:space="preserve">aquí estoy</w:t>
+      </w:r>
+      <w:r>
+        <w:rPr>
+          <w:iCs/>
+          <w:i/>
+        </w:rPr>
+        <w:t xml:space="preserve">”</w:t>
+      </w:r>
+      <w:r>
+        <w:t xml:space="preserve">.</w:t>
+      </w:r>
+    </w:p>
+    <w:p>
+      <w:pPr>
+        <w:pStyle w:val="BodyText"/>
+      </w:pPr>
+      <w:r>
+        <w:t xml:space="preserve">Pero nadie viene. Nunca viene nadie.</w:t>
+      </w:r>
+    </w:p>
+    <w:p>
+      <w:pPr>
+        <w:pStyle w:val="BodyText"/>
+      </w:pPr>
+      <w:r>
+        <w:t xml:space="preserve">Y lo peor es que ya me acostumbré. Me acostumbré a la banqueta.</w:t>
       </w:r>
     </w:p>
     <w:p>
@@ -791,134 +1365,63 @@
           <w:bCs/>
           <w:b/>
         </w:rPr>
-        <w:t xml:space="preserve">Jueves 5 de septiembre — 6:45 p.m.</w:t>
-      </w:r>
-    </w:p>
-    <w:p>
-      <w:pPr>
-        <w:pStyle w:val="BodyText"/>
-      </w:pPr>
-      <w:r>
-        <w:t xml:space="preserve">Hoy pasó algo pequeño y quiero dejarlo escrito antes de que se me olvide, porque a veces las cosas pequeñas son las únicas que de verdad importan.</w:t>
-      </w:r>
-    </w:p>
-    <w:p>
-      <w:pPr>
-        <w:pStyle w:val="BodyText"/>
-      </w:pPr>
-      <w:r>
-        <w:t xml:space="preserve">Salí a comprar tortillas. Era lo único que faltaba en la casa y mi mamá lo había anotado en la nota de ayer, abajo, en letras chiquitas:</w:t>
-      </w:r>
-      <w:r>
-        <w:t xml:space="preserve"> </w:t>
-      </w:r>
-      <w:r>
-        <w:rPr>
-          <w:iCs/>
-          <w:i/>
-        </w:rPr>
-        <w:t xml:space="preserve">“</w:t>
-      </w:r>
-      <w:r>
-        <w:rPr>
-          <w:iCs/>
-          <w:i/>
-        </w:rPr>
-        <w:t xml:space="preserve">y tortillas, si puedes.</w:t>
-      </w:r>
-      <w:r>
-        <w:rPr>
-          <w:iCs/>
-          <w:i/>
-        </w:rPr>
-        <w:t xml:space="preserve">”</w:t>
-      </w:r>
-      <w:r>
-        <w:t xml:space="preserve"> </w:t>
-      </w:r>
-      <w:r>
-        <w:t xml:space="preserve">Fui. En la tortillería había una señora de la edad de mi abuela, con una bolsa de mandado y el pelo recogido con un listón. Cuando me tocó pagar, se me cayó una moneda al suelo y rodó hasta sus zapatos. Ella se agachó, con trabajo, y me la devolvió con las dos manos.</w:t>
-      </w:r>
-    </w:p>
-    <w:p>
-      <w:pPr>
-        <w:pStyle w:val="BodyText"/>
-      </w:pPr>
-      <w:r>
-        <w:t xml:space="preserve">—Aquí tiene, mijo —dijo.</w:t>
-      </w:r>
-    </w:p>
-    <w:p>
-      <w:pPr>
-        <w:pStyle w:val="BodyText"/>
-      </w:pPr>
-      <w:r>
-        <w:t xml:space="preserve">Y me sonrió.</w:t>
-      </w:r>
-    </w:p>
-    <w:p>
-      <w:pPr>
-        <w:pStyle w:val="BodyText"/>
-      </w:pPr>
-      <w:r>
-        <w:t xml:space="preserve">Fue nada. Una sonrisa de una señora cualquiera en una tortillería. Pero me quedé parado un segundo más de lo normal, con la moneda en la palma, porque hacía mucho que alguien me llamaba</w:t>
-      </w:r>
-      <w:r>
-        <w:t xml:space="preserve"> </w:t>
-      </w:r>
-      <w:r>
-        <w:t xml:space="preserve">“</w:t>
-      </w:r>
-      <w:r>
-        <w:t xml:space="preserve">mijo</w:t>
-      </w:r>
-      <w:r>
-        <w:t xml:space="preserve">”</w:t>
-      </w:r>
-      <w:r>
-        <w:t xml:space="preserve">. Hacía mucho que alguien me miraba a los ojos sin esperar nada de mí. Hacía mucho que algo tan chico me calentaba el pecho.</w:t>
-      </w:r>
-    </w:p>
-    <w:p>
-      <w:pPr>
-        <w:pStyle w:val="BodyText"/>
-      </w:pPr>
-      <w:r>
-        <w:t xml:space="preserve">Salí a la calle y me dieron ganas de llorar. No de tristeza exactamente, sino de otra cosa que no sé nombrar. Como cuando te quitan un peso de encima y tu cuerpo se da cuenta de golpe de todo el tiempo que lo estuvo cargando.</w:t>
-      </w:r>
-    </w:p>
-    <w:p>
-      <w:pPr>
-        <w:pStyle w:val="BodyText"/>
-      </w:pPr>
-      <w:r>
-        <w:t xml:space="preserve">Caminé hasta la casa con las tortillas calientes contra el pecho, y lloré en silencio todo el camino. Nadie me vio. O si me vieron, no dijeron nada. Eso también es una forma de ternura.</w:t>
-      </w:r>
-    </w:p>
-    <w:p>
-      <w:pPr>
-        <w:pStyle w:val="BodyText"/>
-      </w:pPr>
-      <w:r>
-        <w:t xml:space="preserve">Cuando llegué, metí las tortillas en el trapo, las dejé en la mesa y me senté. Y por primera vez en mucho tiempo no abrí el celular. No miré el perfil que no debería mirar. No revisé nada. Me quedé ahí, sentado en la cocina vacía, escuchando cómo el refrigerador zumbaba como un animal dormido, y pensé:</w:t>
-      </w:r>
-      <w:r>
-        <w:t xml:space="preserve"> </w:t>
-      </w:r>
-      <w:r>
-        <w:rPr>
-          <w:iCs/>
-          <w:i/>
-        </w:rPr>
-        <w:t xml:space="preserve">quizá esto es lo que se siente cuando uno decide quedarse un día más.</w:t>
-      </w:r>
-    </w:p>
-    <w:p>
-      <w:pPr>
-        <w:pStyle w:val="BodyText"/>
-      </w:pPr>
-      <w:r>
-        <w:t xml:space="preserve">No fue una gran decisión. No hubo música de fondo ni una luz que bajara del techo. Solo la certeza pequeña de que mañana podría intentar de nuevo, aunque fuera con las mismas fuerzas de hoy.</w:t>
+        <w:t xml:space="preserve">Jueves 5 de septiembre — 2:40 a.m.</w:t>
+      </w:r>
+    </w:p>
+    <w:p>
+      <w:pPr>
+        <w:pStyle w:val="BodyText"/>
+      </w:pPr>
+      <w:r>
+        <w:t xml:space="preserve">No es que quiera morirme. Quiero que eso quede escrito, para que no se malinterprete, aunque nadie vaya a leerlo. Lo que quiero es que deje de pesar. Que el cuerpo se me sienta ligero otra vez, como cuando era niño y corría sin saber hacia dónde. Hay una diferencia enorme entre querer desaparecer y querer descansar, y no siempre sé en cuál de las dos estoy parado.</w:t>
+      </w:r>
+    </w:p>
+    <w:p>
+      <w:pPr>
+        <w:pStyle w:val="BodyText"/>
+      </w:pPr>
+      <w:r>
+        <w:t xml:space="preserve">Hay noches en que el cansancio es tan grande que no se quita durmiendo. Es un cansancio de adentro, de algo que ya no tiene fuerzas para seguir fingiendo. Fingir que estoy bien. Fingir que tengo planes. Fingir que me interesa el futuro. Fingir que no escuché lo que escuché en la cocina. Fingir me agotó más que cualquier otra cosa que haya hecho en mi vida.</w:t>
+      </w:r>
+    </w:p>
+    <w:p>
+      <w:pPr>
+        <w:pStyle w:val="BodyText"/>
+      </w:pPr>
+      <w:r>
+        <w:t xml:space="preserve">A veces me pregunto qué pasaría si desapareciera. No de manera dramática. Solo… si un día no estuviera. Si mi cuarto quedara vacío, la cama hecha, el cuaderno cerrado. ¿Cuánto tardarían en notarlo? ¿Una semana? ¿Un mes? ¿Mi mamá lo notaría antes de que Iván le dijera? ¿Chuy se acordaría de mí cuando viera una foto vieja del equipo, o seguiría pasando de largo?</w:t>
+      </w:r>
+    </w:p>
+    <w:p>
+      <w:pPr>
+        <w:pStyle w:val="BodyText"/>
+      </w:pPr>
+      <w:r>
+        <w:t xml:space="preserve">Me da miedo la respuesta. Porque sospecho que la vida de todos seguiría exactamente igual. Que mi ausencia no dejaría un hueco, sino una línea apenas visible, como la marca de un cuadro que alguien quitó de la pared.</w:t>
+      </w:r>
+    </w:p>
+    <w:p>
+      <w:pPr>
+        <w:pStyle w:val="BodyText"/>
+      </w:pPr>
+      <w:r>
+        <w:t xml:space="preserve">Soy tan poco importante que ni mi desaparición cambiaría nada.</w:t>
+      </w:r>
+    </w:p>
+    <w:p>
+      <w:pPr>
+        <w:pStyle w:val="BodyText"/>
+      </w:pPr>
+      <w:r>
+        <w:t xml:space="preserve">Eso es lo más triste que he escrito en mi vida. Y también lo más cierto.</w:t>
+      </w:r>
+    </w:p>
+    <w:p>
+      <w:pPr>
+        <w:pStyle w:val="BodyText"/>
+      </w:pPr>
+      <w:r>
+        <w:t xml:space="preserve">Tal vez por eso escribo. Porque aquí, en esta hoja, por lo menos alguien me escucha. Y si no escucha, por lo menos no me interrumpe.</w:t>
       </w:r>
     </w:p>
     <w:p>
@@ -937,23 +1440,166 @@
           <w:bCs/>
           <w:b/>
         </w:rPr>
-        <w:t xml:space="preserve">Sobre la foto de la pared</w:t>
-      </w:r>
-    </w:p>
-    <w:p>
-      <w:pPr>
-        <w:pStyle w:val="BodyText"/>
-      </w:pPr>
-      <w:r>
-        <w:t xml:space="preserve">Hay una foto pegada con cinta en la pared de mi cuarto, junto al escritorio. Es la única que tengo a la vista. No es de Nayeli, aunque cualquiera lo pensaría.</w:t>
-      </w:r>
-    </w:p>
-    <w:p>
-      <w:pPr>
-        <w:pStyle w:val="BodyText"/>
-      </w:pPr>
-      <w:r>
-        <w:t xml:space="preserve">Todavía no puedo hablar de ella. Cada vez que intento escribir sobre la foto, la mano se me detiene como si el papel estuviera caliente. Un día lo voy a hacer. Lo prometo.</w:t>
+        <w:t xml:space="preserve">Jueves 5 de septiembre — 6:45 p.m.</w:t>
+      </w:r>
+    </w:p>
+    <w:p>
+      <w:pPr>
+        <w:pStyle w:val="BodyText"/>
+      </w:pPr>
+      <w:r>
+        <w:t xml:space="preserve">Hoy pasó algo pequeño y quiero dejarlo escrito, porque a veces las cosas pequeñas son las únicas que de verdad importan.</w:t>
+      </w:r>
+    </w:p>
+    <w:p>
+      <w:pPr>
+        <w:pStyle w:val="BodyText"/>
+      </w:pPr>
+      <w:r>
+        <w:t xml:space="preserve">Salí a comprar tortillas. Mi mamá lo había anotado en la nota de ayer, abajo, en letras chiquitas:</w:t>
+      </w:r>
+      <w:r>
+        <w:t xml:space="preserve"> </w:t>
+      </w:r>
+      <w:r>
+        <w:rPr>
+          <w:iCs/>
+          <w:i/>
+        </w:rPr>
+        <w:t xml:space="preserve">“</w:t>
+      </w:r>
+      <w:r>
+        <w:rPr>
+          <w:iCs/>
+          <w:i/>
+        </w:rPr>
+        <w:t xml:space="preserve">y tortillas, si puedes.</w:t>
+      </w:r>
+      <w:r>
+        <w:rPr>
+          <w:iCs/>
+          <w:i/>
+        </w:rPr>
+        <w:t xml:space="preserve">”</w:t>
+      </w:r>
+      <w:r>
+        <w:t xml:space="preserve"> </w:t>
+      </w:r>
+      <w:r>
+        <w:t xml:space="preserve">Fui.</w:t>
+      </w:r>
+    </w:p>
+    <w:p>
+      <w:pPr>
+        <w:pStyle w:val="BodyText"/>
+      </w:pPr>
+      <w:r>
+        <w:t xml:space="preserve">Antes de salir me detuve un momento frente al imán de Acapulco que sostiene la nota en el refrigerador. Mi mamá lo compró hace años en un mercado. Dijo que algún día íbamos a ir los dos a ver el mar. Yo tenía como doce. Me lo prometió mirándome a los ojos. Creo que ya ni se acuerda. Pero yo sí. Yo me acuerdo de todas las cosas que me prometen, aunque quienes las prometieron las hayan olvidado.</w:t>
+      </w:r>
+    </w:p>
+    <w:p>
+      <w:pPr>
+        <w:pStyle w:val="BodyText"/>
+      </w:pPr>
+      <w:r>
+        <w:t xml:space="preserve">En la tortillería había una señora de la edad de mi abuela, con una bolsa de mandado y el pelo recogido con un listón. Cuando me tocó pagar, se me cayó una moneda al suelo y rodó hasta sus zapatos. Ella se agachó, con trabajo, y me la devolvió con las dos manos.</w:t>
+      </w:r>
+    </w:p>
+    <w:p>
+      <w:pPr>
+        <w:pStyle w:val="BodyText"/>
+      </w:pPr>
+      <w:r>
+        <w:t xml:space="preserve">—Aquí tiene, mijo —dijo.</w:t>
+      </w:r>
+    </w:p>
+    <w:p>
+      <w:pPr>
+        <w:pStyle w:val="BodyText"/>
+      </w:pPr>
+      <w:r>
+        <w:t xml:space="preserve">Y me sonrió.</w:t>
+      </w:r>
+    </w:p>
+    <w:p>
+      <w:pPr>
+        <w:pStyle w:val="BodyText"/>
+      </w:pPr>
+      <w:r>
+        <w:t xml:space="preserve">Fue nada. Una sonrisa de una señora cualquiera. Pero me quedé parado un segundo más de lo normal, con la moneda en la palma, porque hacía mucho que alguien no me llamaba</w:t>
+      </w:r>
+      <w:r>
+        <w:t xml:space="preserve"> </w:t>
+      </w:r>
+      <w:r>
+        <w:t xml:space="preserve">“</w:t>
+      </w:r>
+      <w:r>
+        <w:t xml:space="preserve">mijo</w:t>
+      </w:r>
+      <w:r>
+        <w:t xml:space="preserve">”</w:t>
+      </w:r>
+      <w:r>
+        <w:t xml:space="preserve">. Hacía mucho que alguien me miraba a los ojos sin esperar nada de mí, sin burla, sin lástima, sin prisa.</w:t>
+      </w:r>
+    </w:p>
+    <w:p>
+      <w:pPr>
+        <w:pStyle w:val="BodyText"/>
+      </w:pPr>
+      <w:r>
+        <w:t xml:space="preserve">Salí a la calle y me dieron ganas de llorar. No de tristeza exactamente, sino de otra cosa que no sé nombrar. Como cuando te quitan un peso de encima y tu cuerpo se da cuenta de golpe de todo el tiempo que lo estuvo cargando.</w:t>
+      </w:r>
+    </w:p>
+    <w:p>
+      <w:pPr>
+        <w:pStyle w:val="BodyText"/>
+      </w:pPr>
+      <w:r>
+        <w:t xml:space="preserve">Caminé de regreso con las tortillas calientes contra el pecho y lloré en silencio todo el camino. Y esta vez no me dio vergüenza. Fue un llanto largo, tranquilo, de ese que ya no tiene rabia, solo cansancio. Nadie me vio. O si me vieron, no dijeron nada. Eso también es una forma de ternura.</w:t>
+      </w:r>
+    </w:p>
+    <w:p>
+      <w:pPr>
+        <w:pStyle w:val="BodyText"/>
+      </w:pPr>
+      <w:r>
+        <w:t xml:space="preserve">Pensé:</w:t>
+      </w:r>
+      <w:r>
+        <w:t xml:space="preserve"> </w:t>
+      </w:r>
+      <w:r>
+        <w:rPr>
+          <w:iCs/>
+          <w:i/>
+        </w:rPr>
+        <w:t xml:space="preserve">una señora a la que nunca volveré a ver me llamó mijo, y es la persona que mejor me ha tratado en cinco meses.</w:t>
+      </w:r>
+    </w:p>
+    <w:p>
+      <w:pPr>
+        <w:pStyle w:val="BodyText"/>
+      </w:pPr>
+      <w:r>
+        <w:t xml:space="preserve">Y esa idea, que debería haberme destrozado, de alguna manera me dio una pequeña luz. Porque quiere decir que todavía existe gente así. Gente que mira bien. Gente que no juega.</w:t>
+      </w:r>
+    </w:p>
+    <w:p>
+      <w:pPr>
+        <w:pStyle w:val="BodyText"/>
+      </w:pPr>
+      <w:r>
+        <w:t xml:space="preserve">Solo que no está en mi casa. Ni en mi escuela. Ni en mi pasado.</w:t>
+      </w:r>
+    </w:p>
+    <w:p>
+      <w:pPr>
+        <w:pStyle w:val="BodyText"/>
+      </w:pPr>
+      <w:r>
+        <w:t xml:space="preserve">Tal vez esté en algún lugar que todavía no conozco.</w:t>
       </w:r>
     </w:p>
     <w:p>
@@ -972,6 +1618,41 @@
           <w:bCs/>
           <w:b/>
         </w:rPr>
+        <w:t xml:space="preserve">Sobre la foto de la pared</w:t>
+      </w:r>
+    </w:p>
+    <w:p>
+      <w:pPr>
+        <w:pStyle w:val="BodyText"/>
+      </w:pPr>
+      <w:r>
+        <w:t xml:space="preserve">Hay una foto pegada con cinta en la pared de mi cuarto, junto al escritorio. Es la única que tengo a la vista. No es de Nayeli, aunque cualquiera lo pensaría.</w:t>
+      </w:r>
+    </w:p>
+    <w:p>
+      <w:pPr>
+        <w:pStyle w:val="BodyText"/>
+      </w:pPr>
+      <w:r>
+        <w:t xml:space="preserve">Todavía no puedo hablar de ella. Cada vez que intento escribir sobre la foto, la mano se me detiene como si el papel estuviera caliente. Un día lo voy a hacer. Lo prometo.</w:t>
+      </w:r>
+    </w:p>
+    <w:p>
+      <w:r>
+        <w:pict>
+          <v:rect style="width:0;height:1.5pt" o:hralign="center" o:hrstd="t" o:hr="t"/>
+        </w:pict>
+      </w:r>
+    </w:p>
+    <w:p>
+      <w:pPr>
+        <w:pStyle w:val="FirstParagraph"/>
+      </w:pPr>
+      <w:r>
+        <w:rPr>
+          <w:bCs/>
+          <w:b/>
+        </w:rPr>
         <w:t xml:space="preserve">Viernes 6 de septiembre — 12:15 a.m.</w:t>
       </w:r>
     </w:p>
@@ -980,7 +1661,7 @@
         <w:pStyle w:val="BodyText"/>
       </w:pPr>
       <w:r>
-        <w:t xml:space="preserve">Anoche me quedé pensando en algo que dijo mi mamá hace años, cuando yo era niño y tenía miedo de la oscuridad. Se sentó en el borde de mi cama y me dijo:</w:t>
+        <w:t xml:space="preserve">Anoche, mientras trataba de dormir, me acordé de algo que mi mamá me dijo cuando yo era niño y tenía miedo de la oscuridad. Se sentó en el borde de mi cama y me dijo:</w:t>
       </w:r>
       <w:r>
         <w:t xml:space="preserve"> </w:t>
@@ -1020,55 +1701,147 @@
         <w:pStyle w:val="BodyText"/>
       </w:pPr>
       <w:r>
-        <w:t xml:space="preserve">Y yo estoy empezando a sospechar que necesito esa honestidad, aunque me duela. Que no puedo seguir llenando los días de ruido para no escucharme. Que algún día voy a tener que sentarme con el dolor frente a frente y preguntarle qué quiere, qué viene a enseñarme, cuánto tiempo más piensa quedarse.</w:t>
-      </w:r>
-    </w:p>
-    <w:p>
-      <w:pPr>
-        <w:pStyle w:val="BodyText"/>
-      </w:pPr>
-      <w:r>
-        <w:t xml:space="preserve">Hoy no. Hoy solo quería dejar constancia de que sigo aquí.</w:t>
-      </w:r>
-    </w:p>
-    <w:p>
-      <w:pPr>
-        <w:pStyle w:val="BodyText"/>
-      </w:pPr>
-      <w:r>
-        <w:t xml:space="preserve">Si algún día alguien abre este cuaderno, quisiera que supiera que pasé por esto, que dolió, que muchas veces no supe qué hacer, y que aun así, entre las galletas con cajeta y las noches largas, seguí escribiendo. Que no fue valentía. Fue la costumbre de respirar un día más.</w:t>
-      </w:r>
-    </w:p>
-    <w:p>
-      <w:pPr>
-        <w:pStyle w:val="BodyText"/>
-      </w:pPr>
-      <w:r>
-        <w:t xml:space="preserve">Mi mamá todavía no ha llegado. Son casi las doce y cuarto y la calle está en silencio. Por la ventana se ve la azotea del vecino, con el tinaco blanco, la ropa tendida y una antena vieja inclinada hacia la izquierda, como si también estuviera cansada. Me quedé mirándola mucho rato. Pensé que yo soy igual: una antena apuntando hacia donde ya no hay señal, esperando que algo, lo que sea, llegue algún día.</w:t>
-      </w:r>
-    </w:p>
-    <w:p>
-      <w:pPr>
-        <w:pStyle w:val="BodyText"/>
-      </w:pPr>
-      <w:r>
-        <w:t xml:space="preserve">La raya naranja del foco de la calle ya está en el techo. El perro, o la nube, está ahí. Me acompaña. Es lo único que se queda sin que yo se lo pida.</w:t>
-      </w:r>
-    </w:p>
-    <w:p>
-      <w:pPr>
-        <w:pStyle w:val="BodyText"/>
-      </w:pPr>
-      <w:r>
-        <w:t xml:space="preserve">Mañana voy a intentar contestarle a Chuy con palabras. Es poco. Pero es mejor que un emoji.</w:t>
-      </w:r>
-    </w:p>
-    <w:p>
-      <w:pPr>
-        <w:pStyle w:val="BodyText"/>
-      </w:pPr>
-      <w:r>
-        <w:t xml:space="preserve">Mañana también voy a comer algo que no sean galletas.</w:t>
+        <w:t xml:space="preserve">Hoy casi no vi a mi mamá. Llegó a las siete, como siempre, y yo estaba despierto, escuchándola desde la cama. Escuché los pasos en la cocina, la cafetera, el agua del fregadero. Y por un momento, por un solo momento, tuve ganas de levantarme. De salir y decirle:</w:t>
+      </w:r>
+      <w:r>
+        <w:t xml:space="preserve"> </w:t>
+      </w:r>
+      <w:r>
+        <w:rPr>
+          <w:iCs/>
+          <w:i/>
+        </w:rPr>
+        <w:t xml:space="preserve">“</w:t>
+      </w:r>
+      <w:r>
+        <w:rPr>
+          <w:iCs/>
+          <w:i/>
+        </w:rPr>
+        <w:t xml:space="preserve">Mamá, no estoy bien.</w:t>
+      </w:r>
+      <w:r>
+        <w:rPr>
+          <w:iCs/>
+          <w:i/>
+        </w:rPr>
+        <w:t xml:space="preserve">”</w:t>
+      </w:r>
+      <w:r>
+        <w:t xml:space="preserve"> </w:t>
+      </w:r>
+      <w:r>
+        <w:t xml:space="preserve">Así, tal cual. Cuatro palabras. Nada más.</w:t>
+      </w:r>
+    </w:p>
+    <w:p>
+      <w:pPr>
+        <w:pStyle w:val="BodyText"/>
+      </w:pPr>
+      <w:r>
+        <w:t xml:space="preserve">Me levanté. Llegué hasta la puerta. Puse la mano en la perilla.</w:t>
+      </w:r>
+    </w:p>
+    <w:p>
+      <w:pPr>
+        <w:pStyle w:val="BodyText"/>
+      </w:pPr>
+      <w:r>
+        <w:t xml:space="preserve">Y escuché que hablaba por teléfono con Iván. Se reía. Le decía que le iba a guardar comida para cuando llegara, que no se preocupara, que ella le preparaba lo que quisiera.</w:t>
+      </w:r>
+    </w:p>
+    <w:p>
+      <w:pPr>
+        <w:pStyle w:val="BodyText"/>
+      </w:pPr>
+      <w:r>
+        <w:t xml:space="preserve">Me quedé ahí, con la mano en la perilla. Un minuto. Dos. Hasta que las piernas me dolieron.</w:t>
+      </w:r>
+    </w:p>
+    <w:p>
+      <w:pPr>
+        <w:pStyle w:val="BodyText"/>
+      </w:pPr>
+      <w:r>
+        <w:t xml:space="preserve">Y regresé a la cama.</w:t>
+      </w:r>
+    </w:p>
+    <w:p>
+      <w:pPr>
+        <w:pStyle w:val="BodyText"/>
+      </w:pPr>
+      <w:r>
+        <w:t xml:space="preserve">No sé si hice lo correcto. No sé si mi mamá hubiera escuchado. A veces creo que sí, que me habría abrazado como en la banqueta, que habría llorado conmigo. Y otras veces creo que me habría dicho</w:t>
+      </w:r>
+      <w:r>
+        <w:t xml:space="preserve"> </w:t>
+      </w:r>
+      <w:r>
+        <w:rPr>
+          <w:iCs/>
+          <w:i/>
+        </w:rPr>
+        <w:t xml:space="preserve">“</w:t>
+      </w:r>
+      <w:r>
+        <w:rPr>
+          <w:iCs/>
+          <w:i/>
+        </w:rPr>
+        <w:t xml:space="preserve">ay, hijo, no empieces, estoy muy cansada.</w:t>
+      </w:r>
+      <w:r>
+        <w:rPr>
+          <w:iCs/>
+          <w:i/>
+        </w:rPr>
+        <w:t xml:space="preserve">”</w:t>
+      </w:r>
+      <w:r>
+        <w:t xml:space="preserve"> </w:t>
+      </w:r>
+      <w:r>
+        <w:t xml:space="preserve">Y esa segunda posibilidad me da tanto miedo que prefiero no averiguarlo.</w:t>
+      </w:r>
+    </w:p>
+    <w:p>
+      <w:pPr>
+        <w:pStyle w:val="BodyText"/>
+      </w:pPr>
+      <w:r>
+        <w:t xml:space="preserve">Por eso me quedo con la primera. Es la que me permite seguir.</w:t>
+      </w:r>
+    </w:p>
+    <w:p>
+      <w:pPr>
+        <w:pStyle w:val="BodyText"/>
+      </w:pPr>
+      <w:r>
+        <w:t xml:space="preserve">Si algún día alguien abre este cuaderno, quisiera que supiera que pasé por esto. Que dolió. Que muchas veces no supe qué hacer. Y que aun así, entre las galletas con cajeta y las noches largas, seguí escribiendo. Que no fue valentía. Fue la costumbre de respirar un día más.</w:t>
+      </w:r>
+    </w:p>
+    <w:p>
+      <w:pPr>
+        <w:pStyle w:val="BodyText"/>
+      </w:pPr>
+      <w:r>
+        <w:t xml:space="preserve">Por la ventana se ve la azotea del vecino, con el tinaco blanco, la ropa tendida y una antena vieja inclinada hacia la izquierda, como si también estuviera cansada. Me quedé mirándola mucho rato. Pensé que yo soy igual: una antena apuntando hacia donde ya no hay señal, esperando que algo, lo que sea, llegue algún día.</w:t>
+      </w:r>
+    </w:p>
+    <w:p>
+      <w:pPr>
+        <w:pStyle w:val="BodyText"/>
+      </w:pPr>
+      <w:r>
+        <w:t xml:space="preserve">La raya naranja del foco de la calle ya está en el techo. Ahí está la mancha de humedad. Hoy parece un perro. Mañana, tal vez, una nube. Es lo único que se queda sin que yo se lo pida.</w:t>
+      </w:r>
+    </w:p>
+    <w:p>
+      <w:pPr>
+        <w:pStyle w:val="BodyText"/>
+      </w:pPr>
+      <w:r>
+        <w:t xml:space="preserve">Mañana voy a intentar buscar trabajo otra vez. El lugar número veinticuatro. No porque crea que me van a contratar. Sino porque si dejo de intentar, entonces Iván tuvo razón, y yo no quiero darle esa victoria a nadie. Ni siquiera a mí.</w:t>
       </w:r>
     </w:p>
     <w:p>

</xml_diff>